<commit_message>
Remove "Standard HR Format" subtitle from yearly review template
Co-Authored-By: Claude Opus 5.5 <noreply@anthropic.com>
</commit_message>
<xml_diff>
--- a/demo/templates/yearly-performance-review.docx
+++ b/demo/templates/yearly-performance-review.docx
@@ -24,17 +24,6 @@
           <w:sz w:val="26"/>
         </w:rPr>
         <w:t>ANNUAL EMPLOYEE PERFORMANCE REVIEW</w:t>
-      </w:r>
-    </w:p>
-    <w:p>
-      <w:pPr>
-        <w:jc w:val="center"/>
-      </w:pPr>
-      <w:r>
-        <w:rPr>
-          <w:i/>
-        </w:rPr>
-        <w:t>Standard HR Format</w:t>
       </w:r>
     </w:p>
     <w:p>

</xml_diff>